<commit_message>
Reorganizacion ISO, limpieza de cedula personal y autoconfiguracion de prueba
</commit_message>
<xml_diff>
--- a/Expedientes_Estudiantes/Camarena Khathia - 8.docx
+++ b/Expedientes_Estudiantes/Camarena Khathia - 8.docx
@@ -193,6 +193,48 @@
           <w:p>
             <w:r>
               <w:t>No llego a la escuela</w:t>
+            </w:r>
+          </w:p>
+        </w:tc>
+      </w:tr>
+      <w:tr>
+        <w:tc>
+          <w:tcPr>
+            <w:tcW w:type="dxa" w:w="2160"/>
+          </w:tcPr>
+          <w:p>
+            <w:r>
+              <w:t>2</w:t>
+            </w:r>
+          </w:p>
+        </w:tc>
+        <w:tc>
+          <w:tcPr>
+            <w:tcW w:type="dxa" w:w="2160"/>
+          </w:tcPr>
+          <w:p>
+            <w:r>
+              <w:t>10-06</w:t>
+            </w:r>
+          </w:p>
+        </w:tc>
+        <w:tc>
+          <w:tcPr>
+            <w:tcW w:type="dxa" w:w="2160"/>
+          </w:tcPr>
+          <w:p>
+            <w:r>
+              <w:t>Ausencia</w:t>
+            </w:r>
+          </w:p>
+        </w:tc>
+        <w:tc>
+          <w:tcPr>
+            <w:tcW w:type="dxa" w:w="2160"/>
+          </w:tcPr>
+          <w:p>
+            <w:r>
+              <w:t>No llego a clase</w:t>
             </w:r>
           </w:p>
         </w:tc>

</xml_diff>